<commit_message>
Circolare: colonna contatti come casella di testo ancorata (Pages/Anteprima); scheda staff più schematica
Co-Authored-By: Claude Opus 5.5 <noreply@anthropic.com>
Claude-Session: https://claude.ai/code/session_016AkrT3ymLm6vK1gBJ58HYV
</commit_message>
<xml_diff>
--- a/circolare/base.docx
+++ b/circolare/base.docx
@@ -598,6 +598,771 @@
         </wp:anchor>
       </w:drawing>
     </w:r>
+    <w:r>
+      <w:rPr>
+        <w:noProof/>
+      </w:rPr>
+      <mc:AlternateContent>
+        <mc:Choice Requires="wps">
+          <w:drawing>
+            <wp:anchor distT="0" distB="0" distL="0" distR="402590" simplePos="0" relativeHeight="251700000" behindDoc="0" locked="0" layoutInCell="1" allowOverlap="1">
+              <wp:simplePos x="0" y="0"/>
+              <wp:positionH relativeFrom="page">
+                <wp:posOffset>974725</wp:posOffset>
+              </wp:positionH>
+              <wp:positionV relativeFrom="page">
+                <wp:posOffset>720090</wp:posOffset>
+              </wp:positionV>
+              <wp:extent cx="1531620" cy="9175560"/>
+              <wp:effectExtent l="0" t="0" r="0" b="0"/>
+              <wp:wrapSquare wrapText="right"/>
+              <wp:docPr id="901" name="Contatti"/>
+              <wp:cNvGraphicFramePr/>
+              <a:graphic xmlns:a="http://schemas.openxmlformats.org/drawingml/2006/main">
+                <a:graphicData uri="http://schemas.microsoft.com/office/word/2010/wordprocessingShape">
+                  <wps:wsp>
+                    <wps:cNvSpPr txBox="1"/>
+                    <wps:spPr>
+                      <a:xfrm>
+                        <a:off x="0" y="0"/>
+                        <a:ext cx="1531620" cy="9175560"/>
+                      </a:xfrm>
+                      <a:prstGeom prst="rect">
+                        <a:avLst/>
+                      </a:prstGeom>
+                      <a:noFill/>
+                      <a:ln>
+                        <a:noFill/>
+                      </a:ln>
+                    </wps:spPr>
+                    <wps:txbx>
+                      <w:txbxContent>
+                        <w:p>
+                          <w:pPr>
+                            <w:widowControl w:val="0"/>
+                            <w:rPr>
+                              <w:rFonts w:ascii="Montserrat" w:eastAsia="Montserrat" w:hAnsi="Montserrat" w:cs="Montserrat"/>
+                              <w:b/>
+                              <w:color w:val="455556"/>
+                              <w:sz w:val="16"/>
+                              <w:szCs w:val="16"/>
+                            </w:rPr>
+                          </w:pPr>
+                          <w:r>
+                            <w:rPr>
+                              <w:rFonts w:ascii="Montserrat" w:eastAsia="Montserrat" w:hAnsi="Montserrat" w:cs="Montserrat"/>
+                              <w:b/>
+                              <w:color w:val="455556"/>
+                              <w:sz w:val="16"/>
+                              <w:szCs w:val="16"/>
+                            </w:rPr>
+                            <w:t>{{CONT_H}}</w:t>
+                          </w:r>
+                        </w:p>
+                        <w:p>
+                          <w:pPr>
+                            <w:widowControl w:val="0"/>
+                            <w:rPr>
+                              <w:rFonts w:ascii="Montserrat" w:eastAsia="Montserrat" w:hAnsi="Montserrat" w:cs="Montserrat"/>
+                              <w:bCs/>
+                              <w:color w:val="455556"/>
+                              <w:sz w:val="16"/>
+                              <w:szCs w:val="16"/>
+                            </w:rPr>
+                          </w:pPr>
+                          <w:r>
+                            <w:rPr>
+                              <w:rFonts w:ascii="Montserrat" w:eastAsia="Montserrat" w:hAnsi="Montserrat" w:cs="Montserrat"/>
+                              <w:bCs/>
+                              <w:color w:val="455556"/>
+                              <w:sz w:val="16"/>
+                              <w:szCs w:val="16"/>
+                            </w:rPr>
+                            <w:t>{{CU_NOME}}</w:t>
+                          </w:r>
+                        </w:p>
+                        <w:p>
+                          <w:pPr>
+                            <w:widowControl w:val="0"/>
+                            <w:rPr>
+                              <w:rFonts w:ascii="Montserrat" w:eastAsia="Montserrat" w:hAnsi="Montserrat" w:cs="Montserrat"/>
+                              <w:bCs/>
+                              <w:color w:val="455556"/>
+                              <w:sz w:val="16"/>
+                              <w:szCs w:val="16"/>
+                            </w:rPr>
+                          </w:pPr>
+                          <w:r>
+                            <w:rPr>
+                              <w:rFonts w:ascii="Montserrat" w:eastAsia="Montserrat" w:hAnsi="Montserrat" w:cs="Montserrat"/>
+                              <w:bCs/>
+                              <w:color w:val="455556"/>
+                              <w:sz w:val="16"/>
+                              <w:szCs w:val="16"/>
+                            </w:rPr>
+                            <w:t>{{CU_RUOLO}}</w:t>
+                          </w:r>
+                        </w:p>
+                        <w:p>
+                          <w:pPr>
+                            <w:widowControl w:val="0"/>
+                            <w:rPr>
+                              <w:rFonts w:ascii="Montserrat" w:eastAsia="Montserrat" w:hAnsi="Montserrat" w:cs="Montserrat"/>
+                              <w:color w:val="455556"/>
+                              <w:sz w:val="16"/>
+                              <w:szCs w:val="16"/>
+                            </w:rPr>
+                          </w:pPr>
+                          <w:r>
+                            <w:rPr>
+                              <w:rFonts w:ascii="Montserrat" w:eastAsia="Montserrat" w:hAnsi="Montserrat" w:cs="Montserrat"/>
+                              <w:color w:val="455556"/>
+                              <w:sz w:val="16"/>
+                              <w:szCs w:val="16"/>
+                            </w:rPr>
+                            <w:t>{{CU_MAIL}}</w:t>
+                          </w:r>
+                        </w:p>
+                        <w:p>
+                          <w:pPr>
+                            <w:widowControl w:val="0"/>
+                            <w:rPr>
+                              <w:rFonts w:ascii="Montserrat" w:eastAsia="Montserrat" w:hAnsi="Montserrat" w:cs="Montserrat"/>
+                              <w:color w:val="455556"/>
+                              <w:sz w:val="16"/>
+                              <w:szCs w:val="16"/>
+                            </w:rPr>
+                          </w:pPr>
+                          <w:r>
+                            <w:rPr>
+                              <w:rFonts w:ascii="Montserrat" w:eastAsia="Montserrat" w:hAnsi="Montserrat" w:cs="Montserrat"/>
+                              <w:color w:val="455556"/>
+                              <w:sz w:val="16"/>
+                              <w:szCs w:val="16"/>
+                            </w:rPr>
+                            <w:t>{{CU_TEL}}</w:t>
+                          </w:r>
+                        </w:p>
+                        <w:p>
+                          <w:pPr>
+                            <w:widowControl w:val="0"/>
+                            <w:rPr>
+                              <w:rFonts w:ascii="Montserrat" w:eastAsia="Montserrat" w:hAnsi="Montserrat" w:cs="Montserrat"/>
+                              <w:color w:val="455556"/>
+                              <w:sz w:val="16"/>
+                              <w:szCs w:val="16"/>
+                            </w:rPr>
+                          </w:pPr>
+                          <w:r>
+                            <w:rPr>
+                              <w:rFonts w:ascii="Montserrat" w:eastAsia="Montserrat" w:hAnsi="Montserrat" w:cs="Montserrat"/>
+                              <w:color w:val="455556"/>
+                              <w:sz w:val="16"/>
+                              <w:szCs w:val="16"/>
+                            </w:rPr>
+                            <w:t>{{CU_FAX}}</w:t>
+                          </w:r>
+                        </w:p>
+                        <w:p>
+                          <w:pPr>
+                            <w:widowControl w:val="0"/>
+                            <w:rPr>
+                              <w:rFonts w:ascii="Montserrat" w:eastAsia="Montserrat" w:hAnsi="Montserrat" w:cs="Montserrat"/>
+                              <w:b/>
+                              <w:color w:val="606060"/>
+                              <w:sz w:val="16"/>
+                              <w:szCs w:val="16"/>
+                            </w:rPr>
+                          </w:pPr>
+                        </w:p>
+                        <w:p>
+                          <w:pPr>
+                            <w:widowControl w:val="0"/>
+                            <w:rPr>
+                              <w:rFonts w:ascii="Montserrat" w:eastAsia="Montserrat" w:hAnsi="Montserrat" w:cs="Montserrat"/>
+                              <w:b/>
+                              <w:color w:val="455556"/>
+                              <w:sz w:val="16"/>
+                              <w:szCs w:val="16"/>
+                            </w:rPr>
+                          </w:pPr>
+                          <w:r>
+                            <w:rPr>
+                              <w:rFonts w:ascii="Montserrat" w:eastAsia="Montserrat" w:hAnsi="Montserrat" w:cs="Montserrat"/>
+                              <w:b/>
+                              <w:color w:val="455556"/>
+                              <w:sz w:val="16"/>
+                              <w:szCs w:val="16"/>
+                            </w:rPr>
+                            <w:t>{{SEZ_NOME}}</w:t>
+                          </w:r>
+                        </w:p>
+                        <w:p>
+                          <w:pPr>
+                            <w:widowControl w:val="0"/>
+                            <w:ind w:left="20"/>
+                            <w:rPr>
+                              <w:rFonts w:ascii="Montserrat" w:eastAsia="Montserrat" w:hAnsi="Montserrat" w:cs="Montserrat"/>
+                              <w:color w:val="455556"/>
+                              <w:sz w:val="16"/>
+                              <w:szCs w:val="16"/>
+                            </w:rPr>
+                          </w:pPr>
+                          <w:r>
+                            <w:rPr>
+                              <w:rFonts w:ascii="Montserrat" w:eastAsia="Montserrat" w:hAnsi="Montserrat" w:cs="Montserrat"/>
+                              <w:color w:val="455556"/>
+                              <w:sz w:val="16"/>
+                              <w:szCs w:val="16"/>
+                            </w:rPr>
+                            <w:t>{{SEZ_VIA}}</w:t>
+                          </w:r>
+                        </w:p>
+                        <w:p>
+                          <w:pPr>
+                            <w:widowControl w:val="0"/>
+                            <w:rPr>
+                              <w:rFonts w:ascii="Montserrat" w:eastAsia="Montserrat" w:hAnsi="Montserrat" w:cs="Montserrat"/>
+                              <w:color w:val="455556"/>
+                              <w:sz w:val="16"/>
+                              <w:szCs w:val="16"/>
+                            </w:rPr>
+                          </w:pPr>
+                          <w:r>
+                            <w:rPr>
+                              <w:rFonts w:ascii="Montserrat" w:eastAsia="Montserrat" w:hAnsi="Montserrat" w:cs="Montserrat"/>
+                              <w:color w:val="455556"/>
+                              <w:sz w:val="16"/>
+                              <w:szCs w:val="16"/>
+                            </w:rPr>
+                            <w:t>{{SEZ_CITTA}}</w:t>
+                          </w:r>
+                        </w:p>
+                        <w:p>
+                          <w:pPr>
+                            <w:widowControl w:val="0"/>
+                            <w:rPr>
+                              <w:rFonts w:ascii="Montserrat" w:eastAsia="Montserrat" w:hAnsi="Montserrat" w:cs="Montserrat"/>
+                              <w:color w:val="455556"/>
+                              <w:sz w:val="16"/>
+                              <w:szCs w:val="16"/>
+                            </w:rPr>
+                          </w:pPr>
+                          <w:r>
+                            <w:rPr>
+                              <w:rFonts w:ascii="Montserrat" w:eastAsia="Montserrat" w:hAnsi="Montserrat" w:cs="Montserrat"/>
+                              <w:color w:val="455556"/>
+                              <w:sz w:val="16"/>
+                              <w:szCs w:val="16"/>
+                            </w:rPr>
+                            <w:t>{{SEZ_CF}}</w:t>
+                          </w:r>
+                        </w:p>
+                        <w:p>
+                          <w:pPr>
+                            <w:widowControl w:val="0"/>
+                            <w:rPr>
+                              <w:rFonts w:ascii="Montserrat" w:eastAsia="Montserrat" w:hAnsi="Montserrat" w:cs="Montserrat"/>
+                              <w:color w:val="455556"/>
+                              <w:sz w:val="16"/>
+                              <w:szCs w:val="16"/>
+                            </w:rPr>
+                          </w:pPr>
+                        </w:p>
+                        <w:p>
+                          <w:pPr>
+                            <w:widowControl w:val="0"/>
+                            <w:rPr>
+                              <w:rFonts w:ascii="Montserrat" w:eastAsia="Montserrat" w:hAnsi="Montserrat" w:cs="Montserrat"/>
+                              <w:b/>
+                              <w:color w:val="455556"/>
+                              <w:sz w:val="16"/>
+                              <w:szCs w:val="16"/>
+                            </w:rPr>
+                          </w:pPr>
+                          <w:r>
+                            <w:rPr>
+                              <w:rFonts w:ascii="Montserrat" w:eastAsia="Montserrat" w:hAnsi="Montserrat" w:cs="Montserrat"/>
+                              <w:b/>
+                              <w:color w:val="455556"/>
+                              <w:sz w:val="16"/>
+                              <w:szCs w:val="16"/>
+                            </w:rPr>
+                            <w:t>{{SOCIAL_H}}</w:t>
+                          </w:r>
+                        </w:p>
+                        <w:p>
+                          <w:pPr>
+                            <w:widowControl w:val="0"/>
+                            <w:rPr>
+                              <w:rFonts w:ascii="Montserrat" w:eastAsia="Montserrat" w:hAnsi="Montserrat" w:cs="Montserrat"/>
+                              <w:color w:val="455556"/>
+                              <w:sz w:val="16"/>
+                              <w:szCs w:val="16"/>
+                            </w:rPr>
+                          </w:pPr>
+                          <w:r>
+                            <w:rPr>
+                              <w:rFonts w:ascii="Montserrat" w:eastAsia="Montserrat" w:hAnsi="Montserrat" w:cs="Montserrat"/>
+                              <w:color w:val="455556"/>
+                              <w:sz w:val="16"/>
+                              <w:szCs w:val="16"/>
+                            </w:rPr>
+                            <w:t>{{SEZ_SITO}}</w:t>
+                          </w:r>
+                        </w:p>
+                        <w:p>
+                          <w:pPr>
+                            <w:widowControl w:val="0"/>
+                            <w:rPr>
+                              <w:rFonts w:ascii="Montserrat" w:eastAsia="Montserrat" w:hAnsi="Montserrat" w:cs="Montserrat"/>
+                              <w:color w:val="455556"/>
+                              <w:sz w:val="16"/>
+                              <w:szCs w:val="16"/>
+                            </w:rPr>
+                          </w:pPr>
+                          <w:r>
+                            <w:rPr>
+                              <w:rFonts w:ascii="Montserrat" w:eastAsia="Montserrat" w:hAnsi="Montserrat" w:cs="Montserrat"/>
+                              <w:color w:val="455556"/>
+                              <w:sz w:val="16"/>
+                              <w:szCs w:val="16"/>
+                            </w:rPr>
+                            <w:t>{{SEZ_SOCIAL}}</w:t>
+                          </w:r>
+                        </w:p>
+                        <w:p>
+                          <w:pPr>
+                            <w:widowControl w:val="0"/>
+                            <w:ind w:left="-141"/>
+                            <w:rPr>
+                              <w:rFonts w:ascii="Montserrat" w:eastAsia="Montserrat" w:hAnsi="Montserrat" w:cs="Montserrat"/>
+                              <w:color w:val="606060"/>
+                              <w:sz w:val="16"/>
+                              <w:szCs w:val="16"/>
+                            </w:rPr>
+                          </w:pPr>
+                        </w:p>
+                        <w:p>
+                          <w:pPr>
+                            <w:widowControl w:val="0"/>
+                            <w:ind w:right="564"/>
+                            <w:rPr>
+                              <w:rFonts w:ascii="Montserrat" w:eastAsia="Montserrat" w:hAnsi="Montserrat" w:cs="Montserrat"/>
+                              <w:color w:val="455556"/>
+                              <w:sz w:val="16"/>
+                              <w:szCs w:val="16"/>
+                            </w:rPr>
+                          </w:pPr>
+                          <w:r>
+                            <w:rPr>
+                              <w:rFonts w:ascii="Montserrat" w:eastAsia="Montserrat" w:hAnsi="Montserrat" w:cs="Montserrat"/>
+                              <w:color w:val="455556"/>
+                              <w:sz w:val="16"/>
+                              <w:szCs w:val="16"/>
+                            </w:rPr>
+                            <w:t>___________________</w:t>
+                          </w:r>
+                        </w:p>
+                      </w:txbxContent>
+                    </wps:txbx>
+                    <wps:bodyPr rot="0" vert="horz" wrap="square" lIns="0" tIns="0" rIns="0" bIns="805950" anchor="b" anchorCtr="0">
+                      <a:noAutofit/>
+                    </wps:bodyPr>
+                  </wps:wsp>
+                </a:graphicData>
+              </a:graphic>
+            </wp:anchor>
+          </w:drawing>
+        </mc:Choice>
+        <mc:Fallback>
+          <w:pict>
+            <v:shape id="cxContatti" o:spid="_x0000_s2049" type="#_x0000_t202" style="position:absolute;margin-left:76.75pt;margin-top:56.70pt;width:120.60pt;height:722.49pt;z-index:251700000;mso-position-horizontal-relative:page;mso-position-vertical-relative:page;mso-wrap-distance-right:31.7pt;v-text-anchor:bottom" filled="f" stroked="f">
+              <v:textbox inset="0,0,0,63.46pt">
+                <w:txbxContent>
+                  <w:p>
+                    <w:pPr>
+                      <w:widowControl w:val="0"/>
+                      <w:rPr>
+                        <w:rFonts w:ascii="Montserrat" w:eastAsia="Montserrat" w:hAnsi="Montserrat" w:cs="Montserrat"/>
+                        <w:b/>
+                        <w:color w:val="455556"/>
+                        <w:sz w:val="16"/>
+                        <w:szCs w:val="16"/>
+                      </w:rPr>
+                    </w:pPr>
+                    <w:r>
+                      <w:rPr>
+                        <w:rFonts w:ascii="Montserrat" w:eastAsia="Montserrat" w:hAnsi="Montserrat" w:cs="Montserrat"/>
+                        <w:b/>
+                        <w:color w:val="455556"/>
+                        <w:sz w:val="16"/>
+                        <w:szCs w:val="16"/>
+                      </w:rPr>
+                      <w:t>{{CONT_H}}</w:t>
+                    </w:r>
+                  </w:p>
+                  <w:p>
+                    <w:pPr>
+                      <w:widowControl w:val="0"/>
+                      <w:rPr>
+                        <w:rFonts w:ascii="Montserrat" w:eastAsia="Montserrat" w:hAnsi="Montserrat" w:cs="Montserrat"/>
+                        <w:bCs/>
+                        <w:color w:val="455556"/>
+                        <w:sz w:val="16"/>
+                        <w:szCs w:val="16"/>
+                      </w:rPr>
+                    </w:pPr>
+                    <w:r>
+                      <w:rPr>
+                        <w:rFonts w:ascii="Montserrat" w:eastAsia="Montserrat" w:hAnsi="Montserrat" w:cs="Montserrat"/>
+                        <w:bCs/>
+                        <w:color w:val="455556"/>
+                        <w:sz w:val="16"/>
+                        <w:szCs w:val="16"/>
+                      </w:rPr>
+                      <w:t>{{CU_NOME}}</w:t>
+                    </w:r>
+                  </w:p>
+                  <w:p>
+                    <w:pPr>
+                      <w:widowControl w:val="0"/>
+                      <w:rPr>
+                        <w:rFonts w:ascii="Montserrat" w:eastAsia="Montserrat" w:hAnsi="Montserrat" w:cs="Montserrat"/>
+                        <w:bCs/>
+                        <w:color w:val="455556"/>
+                        <w:sz w:val="16"/>
+                        <w:szCs w:val="16"/>
+                      </w:rPr>
+                    </w:pPr>
+                    <w:r>
+                      <w:rPr>
+                        <w:rFonts w:ascii="Montserrat" w:eastAsia="Montserrat" w:hAnsi="Montserrat" w:cs="Montserrat"/>
+                        <w:bCs/>
+                        <w:color w:val="455556"/>
+                        <w:sz w:val="16"/>
+                        <w:szCs w:val="16"/>
+                      </w:rPr>
+                      <w:t>{{CU_RUOLO}}</w:t>
+                    </w:r>
+                  </w:p>
+                  <w:p>
+                    <w:pPr>
+                      <w:widowControl w:val="0"/>
+                      <w:rPr>
+                        <w:rFonts w:ascii="Montserrat" w:eastAsia="Montserrat" w:hAnsi="Montserrat" w:cs="Montserrat"/>
+                        <w:color w:val="455556"/>
+                        <w:sz w:val="16"/>
+                        <w:szCs w:val="16"/>
+                      </w:rPr>
+                    </w:pPr>
+                    <w:r>
+                      <w:rPr>
+                        <w:rFonts w:ascii="Montserrat" w:eastAsia="Montserrat" w:hAnsi="Montserrat" w:cs="Montserrat"/>
+                        <w:color w:val="455556"/>
+                        <w:sz w:val="16"/>
+                        <w:szCs w:val="16"/>
+                      </w:rPr>
+                      <w:t>{{CU_MAIL}}</w:t>
+                    </w:r>
+                  </w:p>
+                  <w:p>
+                    <w:pPr>
+                      <w:widowControl w:val="0"/>
+                      <w:rPr>
+                        <w:rFonts w:ascii="Montserrat" w:eastAsia="Montserrat" w:hAnsi="Montserrat" w:cs="Montserrat"/>
+                        <w:color w:val="455556"/>
+                        <w:sz w:val="16"/>
+                        <w:szCs w:val="16"/>
+                      </w:rPr>
+                    </w:pPr>
+                    <w:r>
+                      <w:rPr>
+                        <w:rFonts w:ascii="Montserrat" w:eastAsia="Montserrat" w:hAnsi="Montserrat" w:cs="Montserrat"/>
+                        <w:color w:val="455556"/>
+                        <w:sz w:val="16"/>
+                        <w:szCs w:val="16"/>
+                      </w:rPr>
+                      <w:t>{{CU_TEL}}</w:t>
+                    </w:r>
+                  </w:p>
+                  <w:p>
+                    <w:pPr>
+                      <w:widowControl w:val="0"/>
+                      <w:rPr>
+                        <w:rFonts w:ascii="Montserrat" w:eastAsia="Montserrat" w:hAnsi="Montserrat" w:cs="Montserrat"/>
+                        <w:color w:val="455556"/>
+                        <w:sz w:val="16"/>
+                        <w:szCs w:val="16"/>
+                      </w:rPr>
+                    </w:pPr>
+                    <w:r>
+                      <w:rPr>
+                        <w:rFonts w:ascii="Montserrat" w:eastAsia="Montserrat" w:hAnsi="Montserrat" w:cs="Montserrat"/>
+                        <w:color w:val="455556"/>
+                        <w:sz w:val="16"/>
+                        <w:szCs w:val="16"/>
+                      </w:rPr>
+                      <w:t>{{CU_FAX}}</w:t>
+                    </w:r>
+                  </w:p>
+                  <w:p>
+                    <w:pPr>
+                      <w:widowControl w:val="0"/>
+                      <w:rPr>
+                        <w:rFonts w:ascii="Montserrat" w:eastAsia="Montserrat" w:hAnsi="Montserrat" w:cs="Montserrat"/>
+                        <w:b/>
+                        <w:color w:val="606060"/>
+                        <w:sz w:val="16"/>
+                        <w:szCs w:val="16"/>
+                      </w:rPr>
+                    </w:pPr>
+                  </w:p>
+                  <w:p>
+                    <w:pPr>
+                      <w:widowControl w:val="0"/>
+                      <w:rPr>
+                        <w:rFonts w:ascii="Montserrat" w:eastAsia="Montserrat" w:hAnsi="Montserrat" w:cs="Montserrat"/>
+                        <w:b/>
+                        <w:color w:val="455556"/>
+                        <w:sz w:val="16"/>
+                        <w:szCs w:val="16"/>
+                      </w:rPr>
+                    </w:pPr>
+                    <w:r>
+                      <w:rPr>
+                        <w:rFonts w:ascii="Montserrat" w:eastAsia="Montserrat" w:hAnsi="Montserrat" w:cs="Montserrat"/>
+                        <w:b/>
+                        <w:color w:val="455556"/>
+                        <w:sz w:val="16"/>
+                        <w:szCs w:val="16"/>
+                      </w:rPr>
+                      <w:t>{{SEZ_NOME}}</w:t>
+                    </w:r>
+                  </w:p>
+                  <w:p>
+                    <w:pPr>
+                      <w:widowControl w:val="0"/>
+                      <w:ind w:left="20"/>
+                      <w:rPr>
+                        <w:rFonts w:ascii="Montserrat" w:eastAsia="Montserrat" w:hAnsi="Montserrat" w:cs="Montserrat"/>
+                        <w:color w:val="455556"/>
+                        <w:sz w:val="16"/>
+                        <w:szCs w:val="16"/>
+                      </w:rPr>
+                    </w:pPr>
+                    <w:r>
+                      <w:rPr>
+                        <w:rFonts w:ascii="Montserrat" w:eastAsia="Montserrat" w:hAnsi="Montserrat" w:cs="Montserrat"/>
+                        <w:color w:val="455556"/>
+                        <w:sz w:val="16"/>
+                        <w:szCs w:val="16"/>
+                      </w:rPr>
+                      <w:t>{{SEZ_VIA}}</w:t>
+                    </w:r>
+                  </w:p>
+                  <w:p>
+                    <w:pPr>
+                      <w:widowControl w:val="0"/>
+                      <w:rPr>
+                        <w:rFonts w:ascii="Montserrat" w:eastAsia="Montserrat" w:hAnsi="Montserrat" w:cs="Montserrat"/>
+                        <w:color w:val="455556"/>
+                        <w:sz w:val="16"/>
+                        <w:szCs w:val="16"/>
+                      </w:rPr>
+                    </w:pPr>
+                    <w:r>
+                      <w:rPr>
+                        <w:rFonts w:ascii="Montserrat" w:eastAsia="Montserrat" w:hAnsi="Montserrat" w:cs="Montserrat"/>
+                        <w:color w:val="455556"/>
+                        <w:sz w:val="16"/>
+                        <w:szCs w:val="16"/>
+                      </w:rPr>
+                      <w:t>{{SEZ_CITTA}}</w:t>
+                    </w:r>
+                  </w:p>
+                  <w:p>
+                    <w:pPr>
+                      <w:widowControl w:val="0"/>
+                      <w:rPr>
+                        <w:rFonts w:ascii="Montserrat" w:eastAsia="Montserrat" w:hAnsi="Montserrat" w:cs="Montserrat"/>
+                        <w:color w:val="455556"/>
+                        <w:sz w:val="16"/>
+                        <w:szCs w:val="16"/>
+                      </w:rPr>
+                    </w:pPr>
+                    <w:r>
+                      <w:rPr>
+                        <w:rFonts w:ascii="Montserrat" w:eastAsia="Montserrat" w:hAnsi="Montserrat" w:cs="Montserrat"/>
+                        <w:color w:val="455556"/>
+                        <w:sz w:val="16"/>
+                        <w:szCs w:val="16"/>
+                      </w:rPr>
+                      <w:t>{{SEZ_CF}}</w:t>
+                    </w:r>
+                  </w:p>
+                  <w:p>
+                    <w:pPr>
+                      <w:widowControl w:val="0"/>
+                      <w:rPr>
+                        <w:rFonts w:ascii="Montserrat" w:eastAsia="Montserrat" w:hAnsi="Montserrat" w:cs="Montserrat"/>
+                        <w:color w:val="455556"/>
+                        <w:sz w:val="16"/>
+                        <w:szCs w:val="16"/>
+                      </w:rPr>
+                    </w:pPr>
+                  </w:p>
+                  <w:p>
+                    <w:pPr>
+                      <w:widowControl w:val="0"/>
+                      <w:rPr>
+                        <w:rFonts w:ascii="Montserrat" w:eastAsia="Montserrat" w:hAnsi="Montserrat" w:cs="Montserrat"/>
+                        <w:b/>
+                        <w:color w:val="455556"/>
+                        <w:sz w:val="16"/>
+                        <w:szCs w:val="16"/>
+                      </w:rPr>
+                    </w:pPr>
+                    <w:r>
+                      <w:rPr>
+                        <w:rFonts w:ascii="Montserrat" w:eastAsia="Montserrat" w:hAnsi="Montserrat" w:cs="Montserrat"/>
+                        <w:b/>
+                        <w:color w:val="455556"/>
+                        <w:sz w:val="16"/>
+                        <w:szCs w:val="16"/>
+                      </w:rPr>
+                      <w:t>{{SOCIAL_H}}</w:t>
+                    </w:r>
+                  </w:p>
+                  <w:p>
+                    <w:pPr>
+                      <w:widowControl w:val="0"/>
+                      <w:rPr>
+                        <w:rFonts w:ascii="Montserrat" w:eastAsia="Montserrat" w:hAnsi="Montserrat" w:cs="Montserrat"/>
+                        <w:color w:val="455556"/>
+                        <w:sz w:val="16"/>
+                        <w:szCs w:val="16"/>
+                      </w:rPr>
+                    </w:pPr>
+                    <w:r>
+                      <w:rPr>
+                        <w:rFonts w:ascii="Montserrat" w:eastAsia="Montserrat" w:hAnsi="Montserrat" w:cs="Montserrat"/>
+                        <w:color w:val="455556"/>
+                        <w:sz w:val="16"/>
+                        <w:szCs w:val="16"/>
+                      </w:rPr>
+                      <w:t>{{SEZ_SITO}}</w:t>
+                    </w:r>
+                  </w:p>
+                  <w:p>
+                    <w:pPr>
+                      <w:widowControl w:val="0"/>
+                      <w:rPr>
+                        <w:rFonts w:ascii="Montserrat" w:eastAsia="Montserrat" w:hAnsi="Montserrat" w:cs="Montserrat"/>
+                        <w:color w:val="455556"/>
+                        <w:sz w:val="16"/>
+                        <w:szCs w:val="16"/>
+                      </w:rPr>
+                    </w:pPr>
+                    <w:r>
+                      <w:rPr>
+                        <w:rFonts w:ascii="Montserrat" w:eastAsia="Montserrat" w:hAnsi="Montserrat" w:cs="Montserrat"/>
+                        <w:color w:val="455556"/>
+                        <w:sz w:val="16"/>
+                        <w:szCs w:val="16"/>
+                      </w:rPr>
+                      <w:t>{{SEZ_SOCIAL}}</w:t>
+                    </w:r>
+                  </w:p>
+                  <w:p>
+                    <w:pPr>
+                      <w:widowControl w:val="0"/>
+                      <w:ind w:left="-141"/>
+                      <w:rPr>
+                        <w:rFonts w:ascii="Montserrat" w:eastAsia="Montserrat" w:hAnsi="Montserrat" w:cs="Montserrat"/>
+                        <w:color w:val="606060"/>
+                        <w:sz w:val="16"/>
+                        <w:szCs w:val="16"/>
+                      </w:rPr>
+                    </w:pPr>
+                  </w:p>
+                  <w:p>
+                    <w:pPr>
+                      <w:widowControl w:val="0"/>
+                      <w:ind w:right="564"/>
+                      <w:rPr>
+                        <w:rFonts w:ascii="Montserrat" w:eastAsia="Montserrat" w:hAnsi="Montserrat" w:cs="Montserrat"/>
+                        <w:color w:val="455556"/>
+                        <w:sz w:val="16"/>
+                        <w:szCs w:val="16"/>
+                      </w:rPr>
+                    </w:pPr>
+                    <w:r>
+                      <w:rPr>
+                        <w:rFonts w:ascii="Montserrat" w:eastAsia="Montserrat" w:hAnsi="Montserrat" w:cs="Montserrat"/>
+                        <w:color w:val="455556"/>
+                        <w:sz w:val="16"/>
+                        <w:szCs w:val="16"/>
+                      </w:rPr>
+                      <w:t>___________________</w:t>
+                    </w:r>
+                  </w:p>
+                </w:txbxContent>
+              </v:textbox>
+              <w10:wrap type="square" side="right" anchorx="page" anchory="page"/>
+            </v:shape>
+          </w:pict>
+        </mc:Fallback>
+      </mc:AlternateContent>
+    </w:r>
+    <w:r>
+      <w:rPr>
+        <w:noProof/>
+      </w:rPr>
+      <w:drawing>
+        <wp:anchor distT="0" distB="0" distL="0" distR="402590" simplePos="0" relativeHeight="251700001" behindDoc="0" locked="0" layoutInCell="1" allowOverlap="1">
+          <wp:simplePos x="0" y="0"/>
+          <wp:positionH relativeFrom="page">
+            <wp:posOffset>974725</wp:posOffset>
+          </wp:positionH>
+          <wp:positionV relativeFrom="page">
+            <wp:posOffset>9149700</wp:posOffset>
+          </wp:positionV>
+          <wp:extent cx="1038225" cy="495950"/>
+          <wp:effectExtent l="0" t="0" r="0" b="0"/>
+          <wp:wrapSquare wrapText="right"/>
+          <wp:docPr id="1" name="image3.jpg"/>
+          <wp:cNvGraphicFramePr/>
+          <a:graphic xmlns:a="http://schemas.openxmlformats.org/drawingml/2006/main">
+            <a:graphicData uri="http://schemas.openxmlformats.org/drawingml/2006/picture">
+              <pic:pic xmlns:pic="http://schemas.openxmlformats.org/drawingml/2006/picture">
+                <pic:nvPicPr>
+                  <pic:cNvPr id="0" name="image3.jpg"/>
+                  <pic:cNvPicPr preferRelativeResize="0"/>
+                </pic:nvPicPr>
+                <pic:blipFill>
+                  <a:blip r:embed="rId3"/>
+                  <a:srcRect t="-2272" b="2272"/>
+                  <a:stretch>
+                    <a:fillRect/>
+                  </a:stretch>
+                </pic:blipFill>
+                <pic:spPr>
+                  <a:xfrm>
+                    <a:off x="0" y="0"/>
+                    <a:ext cx="1038225" cy="495950"/>
+                  </a:xfrm>
+                  <a:prstGeom prst="rect">
+                    <a:avLst/>
+                  </a:prstGeom>
+                  <a:ln/>
+                </pic:spPr>
+              </pic:pic>
+            </a:graphicData>
+          </a:graphic>
+        </wp:anchor>
+      </w:drawing>
+    </w:r>
   </w:p>
   <w:p>
     <w:pPr>
@@ -760,442 +1525,6 @@
       </w:rPr>
     </w:pPr>
   </w:p>
-  <w:tbl>
-    <w:tblPr>
-      <w:tblStyle w:val="a"/>
-      <w:tblpPr w:rightFromText="634" w:topFromText="124" w:bottomFromText="180" w:horzAnchor="margin" w:tblpX="-450" w:tblpYSpec="top"/>
-      <w:tblW w:w="2412" w:type="dxa"/>
-      <w:tblInd w:w="0" w:type="dxa"/>
-      <w:tblBorders>
-        <w:top w:val="single" w:sz="8" w:space="0" w:color="FFFFFF"/>
-        <w:left w:val="single" w:sz="8" w:space="0" w:color="FFFFFF"/>
-        <w:bottom w:val="single" w:sz="8" w:space="0" w:color="FFFFFF"/>
-        <w:right w:val="single" w:sz="8" w:space="0" w:color="FFFFFF"/>
-        <w:insideH w:val="single" w:sz="8" w:space="0" w:color="FFFFFF"/>
-        <w:insideV w:val="single" w:sz="8" w:space="0" w:color="FFFFFF"/>
-      </w:tblBorders>
-      <w:tblLayout w:type="fixed"/>
-      <w:tblLook w:val="0600" w:firstRow="0" w:lastRow="0" w:firstColumn="0" w:lastColumn="0" w:noHBand="1" w:noVBand="1"/>
-    </w:tblPr>
-    <w:tblGrid>
-      <w:gridCol w:w="2412"/>
-    </w:tblGrid>
-    <w:tr>
-      <w:trPr>
-        <w:trHeight w:val="14056"/>
-      </w:trPr>
-      <w:tc>
-        <w:tcPr>
-          <w:tcW w:w="2412" w:type="dxa"/>
-          <w:vAlign w:val="bottom"/>
-        </w:tcPr>
-        <w:p>
-          <w:pPr>
-            <w:widowControl w:val="0"/>
-            <w:rPr>
-              <w:rFonts w:ascii="Montserrat" w:eastAsia="Montserrat" w:hAnsi="Montserrat" w:cs="Montserrat"/>
-              <w:b/>
-              <w:color w:val="455556"/>
-              <w:sz w:val="16"/>
-              <w:szCs w:val="16"/>
-            </w:rPr>
-          </w:pPr>
-          <w:r>
-            <w:rPr>
-              <w:rFonts w:ascii="Montserrat" w:eastAsia="Montserrat" w:hAnsi="Montserrat" w:cs="Montserrat"/>
-              <w:b/>
-              <w:color w:val="455556"/>
-              <w:sz w:val="16"/>
-              <w:szCs w:val="16"/>
-            </w:rPr>
-            <w:t>{{CONT_H}}</w:t>
-          </w:r>
-        </w:p>
-        <w:p>
-          <w:pPr>
-            <w:widowControl w:val="0"/>
-            <w:rPr>
-              <w:rFonts w:ascii="Montserrat" w:eastAsia="Montserrat" w:hAnsi="Montserrat" w:cs="Montserrat"/>
-              <w:bCs/>
-              <w:color w:val="455556"/>
-              <w:sz w:val="16"/>
-              <w:szCs w:val="16"/>
-            </w:rPr>
-          </w:pPr>
-          <w:r>
-            <w:rPr>
-              <w:rFonts w:ascii="Montserrat" w:eastAsia="Montserrat" w:hAnsi="Montserrat" w:cs="Montserrat"/>
-              <w:bCs/>
-              <w:color w:val="455556"/>
-              <w:sz w:val="16"/>
-              <w:szCs w:val="16"/>
-            </w:rPr>
-            <w:t>{{CU_NOME}}</w:t>
-          </w:r>
-        </w:p>
-        <w:p>
-          <w:pPr>
-            <w:widowControl w:val="0"/>
-            <w:rPr>
-              <w:rFonts w:ascii="Montserrat" w:eastAsia="Montserrat" w:hAnsi="Montserrat" w:cs="Montserrat"/>
-              <w:bCs/>
-              <w:color w:val="455556"/>
-              <w:sz w:val="16"/>
-              <w:szCs w:val="16"/>
-            </w:rPr>
-          </w:pPr>
-          <w:r>
-            <w:rPr>
-              <w:rFonts w:ascii="Montserrat" w:eastAsia="Montserrat" w:hAnsi="Montserrat" w:cs="Montserrat"/>
-              <w:bCs/>
-              <w:color w:val="455556"/>
-              <w:sz w:val="16"/>
-              <w:szCs w:val="16"/>
-            </w:rPr>
-            <w:t>{{CU_RUOLO}}</w:t>
-          </w:r>
-        </w:p>
-        <w:p>
-          <w:pPr>
-            <w:widowControl w:val="0"/>
-            <w:rPr>
-              <w:rFonts w:ascii="Montserrat" w:eastAsia="Montserrat" w:hAnsi="Montserrat" w:cs="Montserrat"/>
-              <w:color w:val="455556"/>
-              <w:sz w:val="16"/>
-              <w:szCs w:val="16"/>
-            </w:rPr>
-          </w:pPr>
-          <w:r>
-            <w:rPr>
-              <w:rFonts w:ascii="Montserrat" w:eastAsia="Montserrat" w:hAnsi="Montserrat" w:cs="Montserrat"/>
-              <w:color w:val="455556"/>
-              <w:sz w:val="16"/>
-              <w:szCs w:val="16"/>
-            </w:rPr>
-            <w:t>{{CU_MAIL}}</w:t>
-          </w:r>
-        </w:p>
-        <w:p>
-          <w:pPr>
-            <w:widowControl w:val="0"/>
-            <w:rPr>
-              <w:rFonts w:ascii="Montserrat" w:eastAsia="Montserrat" w:hAnsi="Montserrat" w:cs="Montserrat"/>
-              <w:color w:val="455556"/>
-              <w:sz w:val="16"/>
-              <w:szCs w:val="16"/>
-            </w:rPr>
-          </w:pPr>
-          <w:r>
-            <w:rPr>
-              <w:rFonts w:ascii="Montserrat" w:eastAsia="Montserrat" w:hAnsi="Montserrat" w:cs="Montserrat"/>
-              <w:color w:val="455556"/>
-              <w:sz w:val="16"/>
-              <w:szCs w:val="16"/>
-            </w:rPr>
-            <w:t>{{CU_TEL}}</w:t>
-          </w:r>
-        </w:p>
-        <w:p>
-          <w:pPr>
-            <w:widowControl w:val="0"/>
-            <w:rPr>
-              <w:rFonts w:ascii="Montserrat" w:eastAsia="Montserrat" w:hAnsi="Montserrat" w:cs="Montserrat"/>
-              <w:color w:val="455556"/>
-              <w:sz w:val="16"/>
-              <w:szCs w:val="16"/>
-            </w:rPr>
-          </w:pPr>
-          <w:r>
-            <w:rPr>
-              <w:rFonts w:ascii="Montserrat" w:eastAsia="Montserrat" w:hAnsi="Montserrat" w:cs="Montserrat"/>
-              <w:color w:val="455556"/>
-              <w:sz w:val="16"/>
-              <w:szCs w:val="16"/>
-            </w:rPr>
-            <w:t>{{CU_FAX}}</w:t>
-          </w:r>
-        </w:p>
-        <w:p>
-          <w:pPr>
-            <w:widowControl w:val="0"/>
-            <w:rPr>
-              <w:rFonts w:ascii="Montserrat" w:eastAsia="Montserrat" w:hAnsi="Montserrat" w:cs="Montserrat"/>
-              <w:b/>
-              <w:color w:val="606060"/>
-              <w:sz w:val="16"/>
-              <w:szCs w:val="16"/>
-            </w:rPr>
-          </w:pPr>
-        </w:p>
-        <w:p>
-          <w:pPr>
-            <w:widowControl w:val="0"/>
-            <w:rPr>
-              <w:rFonts w:ascii="Montserrat" w:eastAsia="Montserrat" w:hAnsi="Montserrat" w:cs="Montserrat"/>
-              <w:b/>
-              <w:color w:val="455556"/>
-              <w:sz w:val="16"/>
-              <w:szCs w:val="16"/>
-            </w:rPr>
-          </w:pPr>
-          <w:r>
-            <w:rPr>
-              <w:rFonts w:ascii="Montserrat" w:eastAsia="Montserrat" w:hAnsi="Montserrat" w:cs="Montserrat"/>
-              <w:b/>
-              <w:color w:val="455556"/>
-              <w:sz w:val="16"/>
-              <w:szCs w:val="16"/>
-            </w:rPr>
-            <w:t>{{SEZ_NOME}}</w:t>
-          </w:r>
-        </w:p>
-        <w:p>
-          <w:pPr>
-            <w:widowControl w:val="0"/>
-            <w:ind w:left="20"/>
-            <w:rPr>
-              <w:rFonts w:ascii="Montserrat" w:eastAsia="Montserrat" w:hAnsi="Montserrat" w:cs="Montserrat"/>
-              <w:color w:val="455556"/>
-              <w:sz w:val="16"/>
-              <w:szCs w:val="16"/>
-            </w:rPr>
-          </w:pPr>
-          <w:r>
-            <w:rPr>
-              <w:rFonts w:ascii="Montserrat" w:eastAsia="Montserrat" w:hAnsi="Montserrat" w:cs="Montserrat"/>
-              <w:color w:val="455556"/>
-              <w:sz w:val="16"/>
-              <w:szCs w:val="16"/>
-            </w:rPr>
-            <w:t>{{SEZ_VIA}}</w:t>
-          </w:r>
-        </w:p>
-        <w:p>
-          <w:pPr>
-            <w:widowControl w:val="0"/>
-            <w:rPr>
-              <w:rFonts w:ascii="Montserrat" w:eastAsia="Montserrat" w:hAnsi="Montserrat" w:cs="Montserrat"/>
-              <w:color w:val="455556"/>
-              <w:sz w:val="16"/>
-              <w:szCs w:val="16"/>
-            </w:rPr>
-          </w:pPr>
-          <w:r>
-            <w:rPr>
-              <w:rFonts w:ascii="Montserrat" w:eastAsia="Montserrat" w:hAnsi="Montserrat" w:cs="Montserrat"/>
-              <w:color w:val="455556"/>
-              <w:sz w:val="16"/>
-              <w:szCs w:val="16"/>
-            </w:rPr>
-            <w:t>{{SEZ_CITTA}}</w:t>
-          </w:r>
-        </w:p>
-        <w:p>
-          <w:pPr>
-            <w:widowControl w:val="0"/>
-            <w:rPr>
-              <w:rFonts w:ascii="Montserrat" w:eastAsia="Montserrat" w:hAnsi="Montserrat" w:cs="Montserrat"/>
-              <w:color w:val="455556"/>
-              <w:sz w:val="16"/>
-              <w:szCs w:val="16"/>
-            </w:rPr>
-          </w:pPr>
-          <w:r>
-            <w:rPr>
-              <w:rFonts w:ascii="Montserrat" w:eastAsia="Montserrat" w:hAnsi="Montserrat" w:cs="Montserrat"/>
-              <w:color w:val="455556"/>
-              <w:sz w:val="16"/>
-              <w:szCs w:val="16"/>
-            </w:rPr>
-            <w:t>{{SEZ_CF}}</w:t>
-          </w:r>
-        </w:p>
-        <w:p>
-          <w:pPr>
-            <w:widowControl w:val="0"/>
-            <w:rPr>
-              <w:rFonts w:ascii="Montserrat" w:eastAsia="Montserrat" w:hAnsi="Montserrat" w:cs="Montserrat"/>
-              <w:color w:val="455556"/>
-              <w:sz w:val="16"/>
-              <w:szCs w:val="16"/>
-            </w:rPr>
-          </w:pPr>
-        </w:p>
-        <w:p>
-          <w:pPr>
-            <w:widowControl w:val="0"/>
-            <w:rPr>
-              <w:rFonts w:ascii="Montserrat" w:eastAsia="Montserrat" w:hAnsi="Montserrat" w:cs="Montserrat"/>
-              <w:b/>
-              <w:color w:val="455556"/>
-              <w:sz w:val="16"/>
-              <w:szCs w:val="16"/>
-            </w:rPr>
-          </w:pPr>
-          <w:r>
-            <w:rPr>
-              <w:rFonts w:ascii="Montserrat" w:eastAsia="Montserrat" w:hAnsi="Montserrat" w:cs="Montserrat"/>
-              <w:b/>
-              <w:color w:val="455556"/>
-              <w:sz w:val="16"/>
-              <w:szCs w:val="16"/>
-            </w:rPr>
-            <w:t>{{SOCIAL_H}}</w:t>
-          </w:r>
-        </w:p>
-        <w:p>
-          <w:pPr>
-            <w:widowControl w:val="0"/>
-            <w:rPr>
-              <w:rFonts w:ascii="Montserrat" w:eastAsia="Montserrat" w:hAnsi="Montserrat" w:cs="Montserrat"/>
-              <w:color w:val="455556"/>
-              <w:sz w:val="16"/>
-              <w:szCs w:val="16"/>
-            </w:rPr>
-          </w:pPr>
-          <w:r>
-            <w:rPr>
-              <w:rFonts w:ascii="Montserrat" w:eastAsia="Montserrat" w:hAnsi="Montserrat" w:cs="Montserrat"/>
-              <w:color w:val="455556"/>
-              <w:sz w:val="16"/>
-              <w:szCs w:val="16"/>
-            </w:rPr>
-            <w:t>{{SEZ_SITO}}</w:t>
-          </w:r>
-        </w:p>
-        <w:p>
-          <w:pPr>
-            <w:widowControl w:val="0"/>
-            <w:rPr>
-              <w:rFonts w:ascii="Montserrat" w:eastAsia="Montserrat" w:hAnsi="Montserrat" w:cs="Montserrat"/>
-              <w:color w:val="455556"/>
-              <w:sz w:val="16"/>
-              <w:szCs w:val="16"/>
-            </w:rPr>
-          </w:pPr>
-          <w:r>
-            <w:rPr>
-              <w:rFonts w:ascii="Montserrat" w:eastAsia="Montserrat" w:hAnsi="Montserrat" w:cs="Montserrat"/>
-              <w:color w:val="455556"/>
-              <w:sz w:val="16"/>
-              <w:szCs w:val="16"/>
-            </w:rPr>
-            <w:t>{{SEZ_SOCIAL}}</w:t>
-          </w:r>
-        </w:p>
-        <w:p>
-          <w:pPr>
-            <w:widowControl w:val="0"/>
-            <w:ind w:left="-141"/>
-            <w:rPr>
-              <w:rFonts w:ascii="Montserrat" w:eastAsia="Montserrat" w:hAnsi="Montserrat" w:cs="Montserrat"/>
-              <w:color w:val="606060"/>
-              <w:sz w:val="16"/>
-              <w:szCs w:val="16"/>
-            </w:rPr>
-          </w:pPr>
-        </w:p>
-        <w:p>
-          <w:pPr>
-            <w:widowControl w:val="0"/>
-            <w:ind w:right="564"/>
-            <w:rPr>
-              <w:rFonts w:ascii="Montserrat" w:eastAsia="Montserrat" w:hAnsi="Montserrat" w:cs="Montserrat"/>
-              <w:color w:val="455556"/>
-              <w:sz w:val="16"/>
-              <w:szCs w:val="16"/>
-            </w:rPr>
-          </w:pPr>
-          <w:r>
-            <w:rPr>
-              <w:rFonts w:ascii="Montserrat" w:eastAsia="Montserrat" w:hAnsi="Montserrat" w:cs="Montserrat"/>
-              <w:color w:val="455556"/>
-              <w:sz w:val="16"/>
-              <w:szCs w:val="16"/>
-            </w:rPr>
-            <w:t>___________________</w:t>
-          </w:r>
-        </w:p>
-        <w:p>
-          <w:pPr>
-            <w:widowControl w:val="0"/>
-            <w:ind w:left="-141"/>
-            <w:rPr>
-              <w:rFonts w:ascii="Montserrat" w:eastAsia="Montserrat" w:hAnsi="Montserrat" w:cs="Montserrat"/>
-              <w:color w:val="606060"/>
-              <w:sz w:val="16"/>
-              <w:szCs w:val="16"/>
-            </w:rPr>
-          </w:pPr>
-        </w:p>
-        <w:p>
-          <w:pPr>
-            <w:widowControl w:val="0"/>
-            <w:ind w:left="-141"/>
-            <w:rPr>
-              <w:rFonts w:ascii="Montserrat" w:eastAsia="Montserrat" w:hAnsi="Montserrat" w:cs="Montserrat"/>
-              <w:color w:val="606060"/>
-              <w:sz w:val="16"/>
-              <w:szCs w:val="16"/>
-            </w:rPr>
-          </w:pPr>
-          <w:r>
-            <w:rPr>
-              <w:rFonts w:ascii="Montserrat" w:eastAsia="Montserrat" w:hAnsi="Montserrat" w:cs="Montserrat"/>
-              <w:color w:val="606060"/>
-              <w:sz w:val="16"/>
-              <w:szCs w:val="16"/>
-            </w:rPr>
-            <w:t xml:space="preserve">  </w:t>
-          </w:r>
-          <w:r>
-            <w:rPr>
-              <w:rFonts w:ascii="Montserrat" w:eastAsia="Montserrat" w:hAnsi="Montserrat" w:cs="Montserrat"/>
-              <w:noProof/>
-              <w:color w:val="606060"/>
-              <w:sz w:val="16"/>
-              <w:szCs w:val="16"/>
-            </w:rPr>
-            <w:drawing>
-              <wp:inline distT="114300" distB="114300" distL="114300" distR="114300" wp14:anchorId="70BFA63E" wp14:editId="0359882C">
-                <wp:extent cx="1038225" cy="495950"/>
-                <wp:effectExtent l="0" t="0" r="0" b="0"/>
-                <wp:docPr id="1" name="image3.jpg"/>
-                <wp:cNvGraphicFramePr/>
-                <a:graphic xmlns:a="http://schemas.openxmlformats.org/drawingml/2006/main">
-                  <a:graphicData uri="http://schemas.openxmlformats.org/drawingml/2006/picture">
-                    <pic:pic xmlns:pic="http://schemas.openxmlformats.org/drawingml/2006/picture">
-                      <pic:nvPicPr>
-                        <pic:cNvPr id="0" name="image3.jpg"/>
-                        <pic:cNvPicPr preferRelativeResize="0"/>
-                      </pic:nvPicPr>
-                      <pic:blipFill>
-                        <a:blip r:embed="rId3"/>
-                        <a:srcRect t="-2272" b="2272"/>
-                        <a:stretch>
-                          <a:fillRect/>
-                        </a:stretch>
-                      </pic:blipFill>
-                      <pic:spPr>
-                        <a:xfrm>
-                          <a:off x="0" y="0"/>
-                          <a:ext cx="1038225" cy="495950"/>
-                        </a:xfrm>
-                        <a:prstGeom prst="rect">
-                          <a:avLst/>
-                        </a:prstGeom>
-                        <a:ln/>
-                      </pic:spPr>
-                    </pic:pic>
-                  </a:graphicData>
-                </a:graphic>
-              </wp:inline>
-            </w:drawing>
-          </w:r>
-        </w:p>
-      </w:tc>
-    </w:tr>
-  </w:tbl>
   <w:p>
     <w:pPr>
       <w:shd w:val="clear" w:color="auto" w:fill="FFFFFF"/>

</xml_diff>

<commit_message>
Circolare: colonna contatti ancorata nel corpo della prima pagina (testo a fianco anche in Pages/Anteprima)
Co-Authored-By: Claude Opus 5.5 <noreply@anthropic.com>
Claude-Session: https://claude.ai/code/session_016AkrT3ymLm6vK1gBJ58HYV
</commit_message>
<xml_diff>
--- a/circolare/base.docx
+++ b/circolare/base.docx
@@ -598,6 +598,7 @@
         </wp:anchor>
       </w:drawing>
     </w:r>
+    <!--CXSIDE-->
     <w:r>
       <w:rPr>
         <w:noProof/>
@@ -1341,7 +1342,7 @@
                   <pic:cNvPicPr preferRelativeResize="0"/>
                 </pic:nvPicPr>
                 <pic:blipFill>
-                  <a:blip r:embed="rId3"/>
+                  <a:blip r:embed="rIdCxSoc"/>
                   <a:srcRect t="-2272" b="2272"/>
                   <a:stretch>
                     <a:fillRect/>
@@ -1363,6 +1364,7 @@
         </wp:anchor>
       </w:drawing>
     </w:r>
+    <!--/CXSIDE-->
   </w:p>
   <w:p>
     <w:pPr>
@@ -1515,7 +1517,6 @@
   </w:p>
   <w:p>
     <w:pPr>
-      <w:shd w:val="clear" w:color="auto" w:fill="FFFFFF"/>
       <w:spacing w:after="225" w:line="360" w:lineRule="auto"/>
       <w:jc w:val="both"/>
       <w:rPr>
@@ -1527,7 +1528,6 @@
   </w:p>
   <w:p>
     <w:pPr>
-      <w:shd w:val="clear" w:color="auto" w:fill="FFFFFF"/>
       <w:spacing w:after="225" w:line="360" w:lineRule="auto"/>
       <w:jc w:val="both"/>
       <w:rPr>

</xml_diff>

<commit_message>
Circolare: titolo dell'intestazione spostato a destra del logo della Sezione
Co-Authored-By: Claude Opus 5.5 <noreply@anthropic.com>
Claude-Session: https://claude.ai/code/session_016AkrT3ymLm6vK1gBJ58HYV
</commit_message>
<xml_diff>
--- a/circolare/base.docx
+++ b/circolare/base.docx
@@ -1400,7 +1400,7 @@
       <w:tabs>
         <w:tab w:val="right" w:pos="9638"/>
       </w:tabs>
-      <w:ind w:left="1700" w:hanging="705"/>
+      <w:ind w:left="2100"/>
       <w:rPr>
         <w:rFonts w:ascii="Montserrat" w:eastAsia="Montserrat" w:hAnsi="Montserrat" w:cs="Montserrat"/>
         <w:b/>
@@ -1479,7 +1479,7 @@
       <w:tabs>
         <w:tab w:val="right" w:pos="9638"/>
       </w:tabs>
-      <w:ind w:left="1700" w:hanging="705"/>
+      <w:ind w:left="2100"/>
       <w:rPr>
         <w:rFonts w:ascii="Montserrat" w:eastAsia="Montserrat" w:hAnsi="Montserrat" w:cs="Montserrat"/>
         <w:b/>

</xml_diff>

<commit_message>
Circolare: colonna laterale fino al fondo della prima pagina
Co-Authored-By: Claude Opus 5.5 <noreply@anthropic.com>
Claude-Session: https://claude.ai/code/session_016AkrT3ymLm6vK1gBJ58HYV
</commit_message>
<xml_diff>
--- a/circolare/base.docx
+++ b/circolare/base.docx
@@ -614,7 +614,7 @@
               <wp:positionV relativeFrom="page">
                 <wp:posOffset>720090</wp:posOffset>
               </wp:positionV>
-              <wp:extent cx="1531620" cy="9175560"/>
+              <wp:extent cx="1531620" cy="9972040"/>
               <wp:effectExtent l="0" t="0" r="0" b="0"/>
               <wp:wrapSquare wrapText="right"/>
               <wp:docPr id="901" name="Contatti"/>
@@ -626,7 +626,7 @@
                     <wps:spPr>
                       <a:xfrm>
                         <a:off x="0" y="0"/>
-                        <a:ext cx="1531620" cy="9175560"/>
+                        <a:ext cx="1531620" cy="9972040"/>
                       </a:xfrm>
                       <a:prstGeom prst="rect">
                         <a:avLst/>
@@ -967,7 +967,7 @@
                         </w:p>
                       </w:txbxContent>
                     </wps:txbx>
-                    <wps:bodyPr rot="0" vert="horz" wrap="square" lIns="0" tIns="0" rIns="0" bIns="805950" anchor="b" anchorCtr="0">
+                    <wps:bodyPr rot="0" vert="horz" wrap="square" lIns="0" tIns="0" rIns="0" bIns="1602430" anchor="b" anchorCtr="0">
                       <a:noAutofit/>
                     </wps:bodyPr>
                   </wps:wsp>
@@ -978,8 +978,8 @@
         </mc:Choice>
         <mc:Fallback>
           <w:pict>
-            <v:shape id="cxContatti" o:spid="_x0000_s2049" type="#_x0000_t202" style="position:absolute;margin-left:76.75pt;margin-top:56.70pt;width:120.60pt;height:722.49pt;z-index:251700000;mso-position-horizontal-relative:page;mso-position-vertical-relative:page;mso-wrap-distance-right:31.7pt;v-text-anchor:bottom" filled="f" stroked="f">
-              <v:textbox inset="0,0,0,63.46pt">
+            <v:shape id="cxContatti" o:spid="_x0000_s2049" type="#_x0000_t202" style="position:absolute;margin-left:76.75pt;margin-top:56.70pt;width:120.60pt;height:785.20pt;z-index:251700000;mso-position-horizontal-relative:page;mso-position-vertical-relative:page;mso-wrap-distance-right:31.7pt;v-text-anchor:bottom" filled="f" stroked="f">
+              <v:textbox inset="0,0,0,126.18pt">
                 <w:txbxContent>
                   <w:p>
                     <w:pPr>

</xml_diff>

<commit_message>
Circolare: icone social dentro la colonna, data senza rientro fisso
Co-Authored-By: Claude Opus 5.5 <noreply@anthropic.com>
Claude-Session: https://claude.ai/code/session_016AkrT3ymLm6vK1gBJ58HYV
</commit_message>
<xml_diff>
--- a/circolare/base.docx
+++ b/circolare/base.docx
@@ -614,7 +614,7 @@
               <wp:positionV relativeFrom="page">
                 <wp:posOffset>720090</wp:posOffset>
               </wp:positionV>
-              <wp:extent cx="1531620" cy="9972040"/>
+              <wp:extent cx="1531620" cy="9180195"/>
               <wp:effectExtent l="0" t="0" r="0" b="0"/>
               <wp:wrapSquare wrapText="right"/>
               <wp:docPr id="901" name="Contatti"/>
@@ -626,7 +626,7 @@
                     <wps:spPr>
                       <a:xfrm>
                         <a:off x="0" y="0"/>
-                        <a:ext cx="1531620" cy="9972040"/>
+                        <a:ext cx="1531620" cy="9180195"/>
                       </a:xfrm>
                       <a:prstGeom prst="rect">
                         <a:avLst/>
@@ -935,7 +935,6 @@
                         <w:p>
                           <w:pPr>
                             <w:widowControl w:val="0"/>
-                            <w:ind w:left="-141"/>
                             <w:rPr>
                               <w:rFonts w:ascii="Montserrat" w:eastAsia="Montserrat" w:hAnsi="Montserrat" w:cs="Montserrat"/>
                               <w:color w:val="606060"/>
@@ -965,9 +964,78 @@
                             <w:t>___________________</w:t>
                           </w:r>
                         </w:p>
+                        <w:p>
+                          <w:pPr>
+                            <w:widowControl w:val="0"/>
+                            <w:rPr>
+                              <w:rFonts w:ascii="Montserrat" w:eastAsia="Montserrat" w:hAnsi="Montserrat" w:cs="Montserrat"/>
+                              <w:color w:val="606060"/>
+                              <w:sz w:val="16"/>
+                              <w:szCs w:val="16"/>
+                            </w:rPr>
+                          </w:pPr>
+                          <w:r>
+                            <w:rPr>
+                              <w:rFonts w:ascii="Montserrat" w:eastAsia="Montserrat" w:hAnsi="Montserrat" w:cs="Montserrat"/>
+                              <w:color w:val="606060"/>
+                              <w:sz w:val="16"/>
+                              <w:szCs w:val="16"/>
+                            </w:rPr>
+                            <w:t xml:space="preserve">  </w:t>
+                          </w:r>
+                          <w:r>
+                            <w:rPr>
+                              <w:rFonts w:ascii="Montserrat" w:eastAsia="Montserrat" w:hAnsi="Montserrat" w:cs="Montserrat"/>
+                              <w:noProof/>
+                              <w:color w:val="606060"/>
+                              <w:sz w:val="16"/>
+                              <w:szCs w:val="16"/>
+                            </w:rPr>
+                            <w:drawing>
+                              <wp:inline distT="114300" distB="114300" distL="114300" distR="114300" wp14:anchorId="70BFA63E" wp14:editId="0359882C">
+                                <wp:extent cx="1038225" cy="495950"/>
+                                <wp:effectExtent l="0" t="0" r="0" b="0"/>
+                                <wp:docPr id="1" name="image3.jpg"/>
+                                <wp:cNvGraphicFramePr/>
+                                <a:graphic xmlns:a="http://schemas.openxmlformats.org/drawingml/2006/main">
+                                  <a:graphicData uri="http://schemas.openxmlformats.org/drawingml/2006/picture">
+                                    <pic:pic xmlns:pic="http://schemas.openxmlformats.org/drawingml/2006/picture">
+                                      <pic:nvPicPr>
+                                        <pic:cNvPr id="0" name="image3.jpg"/>
+                                        <pic:cNvPicPr preferRelativeResize="0"/>
+                                      </pic:nvPicPr>
+                                      <pic:blipFill>
+                                        <a:blip r:embed="rIdCxSoc"/>
+                                        <a:srcRect t="-2272" b="2272"/>
+                                        <a:stretch>
+                                          <a:fillRect/>
+                                        </a:stretch>
+                                      </pic:blipFill>
+                                      <pic:spPr>
+                                        <a:xfrm>
+                                          <a:off x="0" y="0"/>
+                                          <a:ext cx="1038225" cy="495950"/>
+                                        </a:xfrm>
+                                        <a:prstGeom prst="rect">
+                                          <a:avLst/>
+                                        </a:prstGeom>
+                                        <a:ln/>
+                                      </pic:spPr>
+                                    </pic:pic>
+                                  </a:graphicData>
+                                </a:graphic>
+                              </wp:inline>
+                            </w:drawing>
+                          </w:r>
+                        </w:p>
+                        <w:p>
+                          <w:pPr>
+                            <w:spacing w:before="0" w:after="0" w:line="400" w:lineRule="exact"/>
+                          </w:pPr>
+                        </w:p>
                       </w:txbxContent>
                     </wps:txbx>
-                    <wps:bodyPr rot="0" vert="horz" wrap="square" lIns="0" tIns="0" rIns="0" bIns="1602430" anchor="b" anchorCtr="0">
+                    <wps:bodyPr rot="0" vert="horz" wrap="square" lIns="0" tIns="0" rIns="0" bIns="0" anchor="b" anchorCtr="0">
                       <a:noAutofit/>
                     </wps:bodyPr>
                   </wps:wsp>
@@ -978,8 +1046,8 @@
         </mc:Choice>
         <mc:Fallback>
           <w:pict>
-            <v:shape id="cxContatti" o:spid="_x0000_s2049" type="#_x0000_t202" style="position:absolute;margin-left:76.75pt;margin-top:56.70pt;width:120.60pt;height:785.20pt;z-index:251700000;mso-position-horizontal-relative:page;mso-position-vertical-relative:page;mso-wrap-distance-right:31.7pt;v-text-anchor:bottom" filled="f" stroked="f">
-              <v:textbox inset="0,0,0,126.18pt">
+            <v:shape id="cxContatti" o:spid="_x0000_s2049" type="#_x0000_t202" style="position:absolute;margin-left:76.75pt;margin-top:56.70pt;width:120.60pt;height:722.85pt;z-index:251700000;mso-position-horizontal-relative:page;mso-position-vertical-relative:page;mso-wrap-distance-right:31.7pt;v-text-anchor:bottom" filled="f" stroked="f">
+              <v:textbox inset="0,0,0,0.00pt">
                 <w:txbxContent>
                   <w:p>
                     <w:pPr>
@@ -1278,7 +1346,6 @@
                   <w:p>
                     <w:pPr>
                       <w:widowControl w:val="0"/>
-                      <w:ind w:left="-141"/>
                       <w:rPr>
                         <w:rFonts w:ascii="Montserrat" w:eastAsia="Montserrat" w:hAnsi="Montserrat" w:cs="Montserrat"/>
                         <w:color w:val="606060"/>
@@ -1307,6 +1374,75 @@
                       </w:rPr>
                       <w:t>___________________</w:t>
                     </w:r>
+                  </w:p>
+                  <w:p>
+                    <w:pPr>
+                      <w:widowControl w:val="0"/>
+                      <w:rPr>
+                        <w:rFonts w:ascii="Montserrat" w:eastAsia="Montserrat" w:hAnsi="Montserrat" w:cs="Montserrat"/>
+                        <w:color w:val="606060"/>
+                        <w:sz w:val="16"/>
+                        <w:szCs w:val="16"/>
+                      </w:rPr>
+                    </w:pPr>
+                    <w:r>
+                      <w:rPr>
+                        <w:rFonts w:ascii="Montserrat" w:eastAsia="Montserrat" w:hAnsi="Montserrat" w:cs="Montserrat"/>
+                        <w:color w:val="606060"/>
+                        <w:sz w:val="16"/>
+                        <w:szCs w:val="16"/>
+                      </w:rPr>
+                      <w:t xml:space="preserve">  </w:t>
+                    </w:r>
+                    <w:r>
+                      <w:rPr>
+                        <w:rFonts w:ascii="Montserrat" w:eastAsia="Montserrat" w:hAnsi="Montserrat" w:cs="Montserrat"/>
+                        <w:noProof/>
+                        <w:color w:val="606060"/>
+                        <w:sz w:val="16"/>
+                        <w:szCs w:val="16"/>
+                      </w:rPr>
+                      <w:drawing>
+                        <wp:inline distT="114300" distB="114300" distL="114300" distR="114300" wp14:anchorId="70BFA63E" wp14:editId="0359882C">
+                          <wp:extent cx="1038225" cy="495950"/>
+                          <wp:effectExtent l="0" t="0" r="0" b="0"/>
+                          <wp:docPr id="1" name="image3.jpg"/>
+                          <wp:cNvGraphicFramePr/>
+                          <a:graphic xmlns:a="http://schemas.openxmlformats.org/drawingml/2006/main">
+                            <a:graphicData uri="http://schemas.openxmlformats.org/drawingml/2006/picture">
+                              <pic:pic xmlns:pic="http://schemas.openxmlformats.org/drawingml/2006/picture">
+                                <pic:nvPicPr>
+                                  <pic:cNvPr id="0" name="image3.jpg"/>
+                                  <pic:cNvPicPr preferRelativeResize="0"/>
+                                </pic:nvPicPr>
+                                <pic:blipFill>
+                                  <a:blip r:embed="rIdCxSoc"/>
+                                  <a:srcRect t="-2272" b="2272"/>
+                                  <a:stretch>
+                                    <a:fillRect/>
+                                  </a:stretch>
+                                </pic:blipFill>
+                                <pic:spPr>
+                                  <a:xfrm>
+                                    <a:off x="0" y="0"/>
+                                    <a:ext cx="1038225" cy="495950"/>
+                                  </a:xfrm>
+                                  <a:prstGeom prst="rect">
+                                    <a:avLst/>
+                                  </a:prstGeom>
+                                  <a:ln/>
+                                </pic:spPr>
+                              </pic:pic>
+                            </a:graphicData>
+                          </a:graphic>
+                        </wp:inline>
+                      </w:drawing>
+                    </w:r>
+                  </w:p>
+                  <w:p>
+                    <w:pPr>
+                      <w:spacing w:before="0" w:after="0" w:line="400" w:lineRule="exact"/>
+                    </w:pPr>
                   </w:p>
                 </w:txbxContent>
               </v:textbox>
@@ -1315,54 +1451,6 @@
           </w:pict>
         </mc:Fallback>
       </mc:AlternateContent>
-    </w:r>
-    <w:r>
-      <w:rPr>
-        <w:noProof/>
-      </w:rPr>
-      <w:drawing>
-        <wp:anchor distT="0" distB="500000" distL="0" distR="895985" simplePos="0" relativeHeight="251700001" behindDoc="0" locked="0" layoutInCell="1" allowOverlap="1">
-          <wp:simplePos x="0" y="0"/>
-          <wp:positionH relativeFrom="page">
-            <wp:posOffset>974725</wp:posOffset>
-          </wp:positionH>
-          <wp:positionV relativeFrom="page">
-            <wp:posOffset>9149700</wp:posOffset>
-          </wp:positionV>
-          <wp:extent cx="1038225" cy="495950"/>
-          <wp:effectExtent l="0" t="0" r="0" b="0"/>
-          <wp:wrapSquare wrapText="right"/>
-          <wp:docPr id="1" name="image3.jpg"/>
-          <wp:cNvGraphicFramePr/>
-          <a:graphic xmlns:a="http://schemas.openxmlformats.org/drawingml/2006/main">
-            <a:graphicData uri="http://schemas.openxmlformats.org/drawingml/2006/picture">
-              <pic:pic xmlns:pic="http://schemas.openxmlformats.org/drawingml/2006/picture">
-                <pic:nvPicPr>
-                  <pic:cNvPr id="0" name="image3.jpg"/>
-                  <pic:cNvPicPr preferRelativeResize="0"/>
-                </pic:nvPicPr>
-                <pic:blipFill>
-                  <a:blip r:embed="rIdCxSoc"/>
-                  <a:srcRect t="-2272" b="2272"/>
-                  <a:stretch>
-                    <a:fillRect/>
-                  </a:stretch>
-                </pic:blipFill>
-                <pic:spPr>
-                  <a:xfrm>
-                    <a:off x="0" y="0"/>
-                    <a:ext cx="1038225" cy="495950"/>
-                  </a:xfrm>
-                  <a:prstGeom prst="rect">
-                    <a:avLst/>
-                  </a:prstGeom>
-                  <a:ln/>
-                </pic:spPr>
-              </pic:pic>
-            </a:graphicData>
-          </a:graphic>
-        </wp:anchor>
-      </w:drawing>
     </w:r>
     <!--/CXSIDE-->
   </w:p>

</xml_diff>